<commit_message>
Record frozen Q1 release snapshot in manuscript
</commit_message>
<xml_diff>
--- a/cee_revision/manuscript_cee_editable.docx
+++ b/cee_revision/manuscript_cee_editable.docx
@@ -16385,22 +16385,31 @@
         <w:t xml:space="preserve"> </w:t>
       </w:r>
       <w:r>
-        <w:t xml:space="preserve">submitted computational snapshot is commit</w:t>
-      </w:r>
-      <w:r>
-        <w:t xml:space="preserve"> </w:t>
-      </w:r>
-      <w:r>
-        <w:t xml:space="preserve">78f8226776853c64da01a70bd0ffbd912ba2ad2a</w:t>
-      </w:r>
-      <w:r>
-        <w:t xml:space="preserve">. A</w:t>
-      </w:r>
-      <w:r>
-        <w:t xml:space="preserve"> </w:t>
-      </w:r>
-      <w:r>
-        <w:t xml:space="preserve">permanent software DOI has not been assigned.</w:t>
+        <w:t xml:space="preserve">frozen computational snapshot is commit</w:t>
+      </w:r>
+      <w:r>
+        <w:t xml:space="preserve"> </w:t>
+      </w:r>
+      <w:r>
+        <w:t xml:space="preserve">e200607e648dbbdd230b881f150de08a6da3e525</w:t>
+      </w:r>
+      <w:r>
+        <w:t xml:space="preserve">, archived under</w:t>
+      </w:r>
+      <w:r>
+        <w:t xml:space="preserve"> </w:t>
+      </w:r>
+      <w:r>
+        <w:t xml:space="preserve">release tag</w:t>
+      </w:r>
+      <w:r>
+        <w:t xml:space="preserve"> </w:t>
+      </w:r>
+      <w:r>
+        <w:t xml:space="preserve">v1.1.0-cee-q1</w:t>
+      </w:r>
+      <w:r>
+        <w:t xml:space="preserve">. A permanent software DOI has not been assigned.</w:t>
       </w:r>
     </w:p>
     <w:bookmarkEnd w:id="196"/>

</xml_diff>

<commit_message>
Add CEE6 prevalence, latency, and figure revision
</commit_message>
<xml_diff>
--- a/cee_revision/manuscript_cee_editable.docx
+++ b/cee_revision/manuscript_cee_editable.docx
@@ -14098,7 +14098,7 @@
       <w:r>
         <w:drawing>
           <wp:inline>
-            <wp:extent cx="5715000" cy="4097066"/>
+            <wp:extent cx="5715000" cy="4297956"/>
             <wp:docPr id="174" name="Picture 174"/>
             <wp:cNvGraphicFramePr>
               <a:graphicFrameLocks noChangeAspect="1"/>
@@ -14119,7 +14119,7 @@
                   <pic:spPr>
                     <a:xfrm>
                       <a:off x="0" y="0"/>
-                      <a:ext cx="5715000" cy="4097066"/>
+                      <a:ext cx="5715000" cy="4297956"/>
                     </a:xfrm>
                     <a:prstGeom prst="rect"/>
                   </pic:spPr>
@@ -14234,7 +14234,7 @@
       <w:r>
         <w:drawing>
           <wp:inline>
-            <wp:extent cx="5715000" cy="4171457"/>
+            <wp:extent cx="5715000" cy="4692683"/>
             <wp:docPr id="175" name="Picture 175"/>
             <wp:cNvGraphicFramePr>
               <a:graphicFrameLocks noChangeAspect="1"/>
@@ -14255,7 +14255,7 @@
                   <pic:spPr>
                     <a:xfrm>
                       <a:off x="0" y="0"/>
-                      <a:ext cx="5715000" cy="4171457"/>
+                      <a:ext cx="5715000" cy="4692683"/>
                     </a:xfrm>
                     <a:prstGeom prst="rect"/>
                   </pic:spPr>

</xml_diff>